<commit_message>
Laboratoire 10 : version simple
</commit_message>
<xml_diff>
--- a/lab10/rapport.docx
+++ b/lab10/rapport.docx
@@ -2,6 +2,126 @@
 <file path=word/document.xml><?xml version="1.0" encoding="utf-8"?>
 <w:document xmlns:w="http://schemas.openxmlformats.org/wordprocessingml/2006/main" xmlns:m="http://schemas.openxmlformats.org/officeDocument/2006/math" xmlns:r="http://schemas.openxmlformats.org/officeDocument/2006/relationships" xmlns:o="urn:schemas-microsoft-com:office:office" xmlns:v="urn:schemas-microsoft-com:vml" xmlns:w10="urn:schemas-microsoft-com:office:word" xmlns:a="http://schemas.openxmlformats.org/drawingml/2006/main" xmlns:pic="http://schemas.openxmlformats.org/drawingml/2006/picture" xmlns:wp="http://schemas.openxmlformats.org/drawingml/2006/wordprocessingDrawing">
   <w:body>
+    <w:p>
+      <w:pPr>
+        <w:pStyle w:val="Title"/>
+      </w:pPr>
+      <w:r>
+        <w:t xml:space="preserve">Laboratoire</w:t>
+      </w:r>
+      <w:r>
+        <w:t xml:space="preserve"> </w:t>
+      </w:r>
+      <w:r>
+        <w:t xml:space="preserve">10:</w:t>
+      </w:r>
+      <w:r>
+        <w:t xml:space="preserve"> </w:t>
+      </w:r>
+      <w:r>
+        <w:t xml:space="preserve">vi</w:t>
+      </w:r>
+    </w:p>
+    <w:p>
+      <w:pPr>
+        <w:pStyle w:val="Author"/>
+      </w:pPr>
+      <w:r>
+        <w:t xml:space="preserve">LISSOM</w:t>
+      </w:r>
+      <w:r>
+        <w:t xml:space="preserve"> </w:t>
+      </w:r>
+      <w:r>
+        <w:t xml:space="preserve">BAYEM</w:t>
+      </w:r>
+      <w:r>
+        <w:t xml:space="preserve"> </w:t>
+      </w:r>
+      <w:r>
+        <w:t xml:space="preserve">ODILON</w:t>
+      </w:r>
+    </w:p>
+    <w:p>
+      <w:pPr>
+        <w:pStyle w:val="Date"/>
+      </w:pPr>
+      <w:r>
+        <w:t xml:space="preserve">22/06/2026</w:t>
+      </w:r>
+    </w:p>
+    <w:bookmarkStart w:id="20" w:name="objectif"/>
+    <w:p>
+      <w:pPr>
+        <w:pStyle w:val="Heading1"/>
+      </w:pPr>
+      <w:r>
+        <w:t xml:space="preserve">1. Objectif</w:t>
+      </w:r>
+    </w:p>
+    <w:p>
+      <w:pPr>
+        <w:pStyle w:val="FirstParagraph"/>
+      </w:pPr>
+      <w:r>
+        <w:t xml:space="preserve">Apprendre vi.</w:t>
+      </w:r>
+    </w:p>
+    <w:bookmarkEnd w:id="20"/>
+    <w:bookmarkStart w:id="21" w:name="travail-réalisé"/>
+    <w:p>
+      <w:pPr>
+        <w:pStyle w:val="Heading1"/>
+      </w:pPr>
+      <w:r>
+        <w:t xml:space="preserve">2. Travail réalisé</w:t>
+      </w:r>
+    </w:p>
+    <w:p>
+      <w:pPr>
+        <w:pStyle w:val="FirstParagraph"/>
+      </w:pPr>
+      <w:r>
+        <w:t xml:space="preserve">Création de hello.sh, modifications, sauvegarde.</w:t>
+      </w:r>
+    </w:p>
+    <w:bookmarkEnd w:id="21"/>
+    <w:bookmarkStart w:id="22" w:name="captures"/>
+    <w:p>
+      <w:pPr>
+        <w:pStyle w:val="Heading1"/>
+      </w:pPr>
+      <w:r>
+        <w:t xml:space="preserve">3. Captures</w:t>
+      </w:r>
+    </w:p>
+    <w:p>
+      <w:pPr>
+        <w:pStyle w:val="FirstParagraph"/>
+      </w:pPr>
+      <w:r>
+        <w:t xml:space="preserve">Les captures sont dans le dossier images.</w:t>
+      </w:r>
+    </w:p>
+    <w:bookmarkEnd w:id="22"/>
+    <w:bookmarkStart w:id="23" w:name="conclusion"/>
+    <w:p>
+      <w:pPr>
+        <w:pStyle w:val="Heading1"/>
+      </w:pPr>
+      <w:r>
+        <w:t xml:space="preserve">4. Conclusion</w:t>
+      </w:r>
+    </w:p>
+    <w:p>
+      <w:pPr>
+        <w:pStyle w:val="FirstParagraph"/>
+      </w:pPr>
+      <w:r>
+        <w:t xml:space="preserve">vi est utile.</w:t>
+      </w:r>
+    </w:p>
+    <w:bookmarkEnd w:id="23"/>
     <w:sectPr/>
   </w:body>
 </w:document>

</xml_diff>